<commit_message>
docs: refresh FIN-9 calibration pre-read for the colleague (post-fix baseline + full scope)
Adds a "current state & session scope" section: the six accuracy waves landed and
Wave 1 wired _overall_score (vulnerability now couples to posture, was pinned 0.5),
so scores de-inflated (phishield 381->169) and the calibration baseline shifted —
anchor to the corrected fixed-code outputs, not the old inflated ones. Frames the
five parameter groups for the session (credential-confidence detailed here; full
table in OUTSTANDING §6b) and points to the sandbox best-attempt comparison doc
(docs/calibration_prep/) as PREP proposals, not final. Re-rendered branded docx.

Co-Authored-By: Claude Opus 4.7 <noreply@anthropic.com>
</commit_message>
<xml_diff>
--- a/security_scanner/docs/Credential_Confidence_pBreach_Calibration_Preread.docx
+++ b/security_scanner/docs/Credential_Confidence_pBreach_Calibration_Preread.docx
@@ -25,7 +25,7 @@
           <w:color w:val="0F2744"/>
           <w:sz w:val="38"/>
         </w:rPr>
-        <w:t>Confidence-Weighted Credential Contribution to p(breach)</w:t>
+        <w:t>FIN-9 Calibration Pre-read</w:t>
       </w:r>
     </w:p>
     <w:p>
@@ -38,7 +38,7 @@
           <w:color w:val="64748B"/>
           <w:sz w:val="19"/>
         </w:rPr>
-        <w:t>Calibration pre-read - FIN-9 session, 2026-06-03</w:t>
+        <w:t>Credential-confidence + the wider parameter set - updated 2026-06-03 (post-fix baseline)</w:t>
       </w:r>
     </w:p>
     <w:p/>
@@ -65,7 +65,7 @@
         <w:rPr>
           <w:b/>
         </w:rPr>
-        <w:t>numbers are placeholders to be set live against the anchors below.</w:t>
+        <w:t>numbers are placeholders to be set with the colleague against the anchors below.</w:t>
       </w:r>
       <w:r>
         <w:t xml:space="preserve"> Do not ship before the 2-step gate + sanity-check. </w:t>
@@ -87,7 +87,16 @@
         <w:t>5L</w:t>
       </w:r>
       <w:r>
-        <w:t>, the §6 "Credential-risk scoring calibration" ticket, and the cat-tail no-double-count rule.</w:t>
+        <w:t xml:space="preserve"> + </w:t>
+      </w:r>
+      <w:r>
+        <w:rPr>
+          <w:b/>
+        </w:rPr>
+        <w:t>§6b</w:t>
+      </w:r>
+      <w:r>
+        <w:t xml:space="preserve"> (full parameter table), the §6 "Credential-risk scoring calibration" ticket, the FIN-9 Pareto memory, and the cat-tail no-double-count rule.</w:t>
       </w:r>
     </w:p>
     <w:p>
@@ -100,6 +109,300 @@
           <w:sz w:val="18"/>
         </w:rPr>
         <w:t>— — —</w:t>
+      </w:r>
+    </w:p>
+    <w:p>
+      <w:pPr>
+        <w:spacing w:before="280" w:after="80"/>
+      </w:pPr>
+      <w:r>
+        <w:rPr>
+          <w:b/>
+          <w:color w:val="0F2744"/>
+          <w:sz w:val="28"/>
+        </w:rPr>
+        <w:t>0. Current state &amp; session scope (read first — updated 2026-06-03)</w:t>
+      </w:r>
+    </w:p>
+    <w:p>
+      <w:r>
+        <w:rPr>
+          <w:b/>
+        </w:rPr>
+        <w:t>What changed since this doc was first written:</w:t>
+      </w:r>
+      <w:r>
+        <w:t xml:space="preserve"> the accuracy back-test + six fix waves landed and were verified end-to-end on a fixed-code production scan. The single most important consequence for calibration: </w:t>
+      </w:r>
+      <w:r>
+        <w:rPr>
+          <w:b/>
+        </w:rPr>
+        <w:t>Wave 1 wired `_overall_score` into the financial calculator for the first time</w:t>
+      </w:r>
+      <w:r>
+        <w:t xml:space="preserve"> — </w:t>
+      </w:r>
+      <w:r>
+        <w:rPr>
+          <w:rFonts w:ascii="Consolas" w:hAnsi="Consolas"/>
+          <w:sz w:val="18"/>
+        </w:rPr>
+        <w:t>vulnerability</w:t>
+      </w:r>
+      <w:r>
+        <w:t xml:space="preserve"> now </w:t>
+      </w:r>
+      <w:r>
+        <w:rPr>
+          <w:i/>
+        </w:rPr>
+        <w:t>couples to the real posture score</w:t>
+      </w:r>
+      <w:r>
+        <w:t xml:space="preserve"> (it was permanently pinned at 0.5). With the de-inflation fixes (SSL no longer auto-"Invalid", DNSBL no longer auto-"blacklisted", the Exposed-Admin 403 inversion gone, phantom WAF/CVE-ASN removed), scores dropped to their true level — phishield.com now scores </w:t>
+      </w:r>
+      <w:r>
+        <w:rPr>
+          <w:b/>
+        </w:rPr>
+        <w:t>169 (Low)</w:t>
+      </w:r>
+      <w:r>
+        <w:t xml:space="preserve"> vs </w:t>
+      </w:r>
+      <w:r>
+        <w:rPr>
+          <w:b/>
+        </w:rPr>
+        <w:t>381 (Medium)</w:t>
+      </w:r>
+      <w:r>
+        <w:t xml:space="preserve"> pre-fix.</w:t>
+      </w:r>
+    </w:p>
+    <w:p>
+      <w:r>
+        <w:rPr>
+          <w:b/>
+        </w:rPr>
+        <w:t>So the calibration baseline has shifted.</w:t>
+      </w:r>
+      <w:r>
+        <w:t xml:space="preserve"> Every parameter below must be anchored to the </w:t>
+      </w:r>
+      <w:r>
+        <w:rPr>
+          <w:b/>
+        </w:rPr>
+        <w:t>corrected fixed-code outputs</w:t>
+      </w:r>
+      <w:r>
+        <w:t xml:space="preserve">, NOT the old inflated ones. The downstream constants were never validated against </w:t>
+      </w:r>
+      <w:r>
+        <w:rPr>
+          <w:i/>
+        </w:rPr>
+        <w:t>working</w:t>
+      </w:r>
+      <w:r>
+        <w:t xml:space="preserve"> coupling (the coupling was broken), so they genuinely need calibration now.</w:t>
+      </w:r>
+    </w:p>
+    <w:p>
+      <w:r>
+        <w:rPr>
+          <w:b/>
+        </w:rPr>
+        <w:t>This session's parameters span five groups</w:t>
+      </w:r>
+      <w:r>
+        <w:t xml:space="preserve"> (this doc details the credential one; the full table is OUTSTANDING §6b):</w:t>
+      </w:r>
+    </w:p>
+    <w:p>
+      <w:pPr>
+        <w:pStyle w:val="ListBullet"/>
+      </w:pPr>
+      <w:r>
+        <w:rPr>
+          <w:b/>
+        </w:rPr>
+        <w:t>p(breach) core</w:t>
+      </w:r>
+      <w:r>
+        <w:t xml:space="preserve"> — the </w:t>
+      </w:r>
+      <w:r>
+        <w:rPr>
+          <w:rFonts w:ascii="Consolas" w:hAnsi="Consolas"/>
+          <w:sz w:val="18"/>
+        </w:rPr>
+        <w:t>vulnerability ← _overall_score</w:t>
+      </w:r>
+      <w:r>
+        <w:t xml:space="preserve"> curve + the </w:t>
+      </w:r>
+      <w:r>
+        <w:rPr>
+          <w:rFonts w:ascii="Consolas" w:hAnsi="Consolas"/>
+          <w:sz w:val="18"/>
+        </w:rPr>
+        <w:t>0.3</w:t>
+      </w:r>
+      <w:r>
+        <w:t xml:space="preserve"> in </w:t>
+      </w:r>
+      <w:r>
+        <w:rPr>
+          <w:rFonts w:ascii="Consolas" w:hAnsi="Consolas"/>
+          <w:sz w:val="18"/>
+        </w:rPr>
+        <w:t>p_breach = vulnerability × TEF × 0.3</w:t>
+      </w:r>
+      <w:r>
+        <w:t>.</w:t>
+      </w:r>
+    </w:p>
+    <w:p>
+      <w:pPr>
+        <w:pStyle w:val="ListBullet"/>
+      </w:pPr>
+      <w:r>
+        <w:rPr>
+          <w:b/>
+        </w:rPr>
+        <w:t>Credential → p(breach) / RSI</w:t>
+      </w:r>
+      <w:r>
+        <w:t xml:space="preserve"> — </w:t>
+      </w:r>
+      <w:r>
+        <w:rPr>
+          <w:b/>
+        </w:rPr>
+        <w:t>the focus of this doc</w:t>
+      </w:r>
+      <w:r>
+        <w:t xml:space="preserve"> (§1–§9 below).</w:t>
+      </w:r>
+    </w:p>
+    <w:p>
+      <w:pPr>
+        <w:pStyle w:val="ListBullet"/>
+      </w:pPr>
+      <w:r>
+        <w:rPr>
+          <w:b/>
+        </w:rPr>
+        <w:t>RSI factor weights</w:t>
+      </w:r>
+      <w:r>
+        <w:t xml:space="preserve"> — the ransomware-vector sizes (+0.25 RDP, etc.).</w:t>
+      </w:r>
+    </w:p>
+    <w:p>
+      <w:pPr>
+        <w:pStyle w:val="ListBullet"/>
+      </w:pPr>
+      <w:r>
+        <w:rPr>
+          <w:b/>
+        </w:rPr>
+        <w:t>SA cost/fine + TEF</w:t>
+      </w:r>
+      <w:r>
+        <w:t xml:space="preserve"> — </w:t>
+      </w:r>
+      <w:r>
+        <w:rPr>
+          <w:rFonts w:ascii="Consolas" w:hAnsi="Consolas"/>
+          <w:sz w:val="18"/>
+        </w:rPr>
+        <w:t>COST_PER_RECORD</w:t>
+      </w:r>
+      <w:r>
+        <w:t xml:space="preserve">, </w:t>
+      </w:r>
+      <w:r>
+        <w:rPr>
+          <w:rFonts w:ascii="Consolas" w:hAnsi="Consolas"/>
+          <w:sz w:val="18"/>
+        </w:rPr>
+        <w:t>REGULATORY_FINE</w:t>
+      </w:r>
+      <w:r>
+        <w:t xml:space="preserve"> (POPIA s109 / Information Regulator reality), industry targeting.</w:t>
+      </w:r>
+    </w:p>
+    <w:p>
+      <w:pPr>
+        <w:pStyle w:val="ListBullet"/>
+      </w:pPr>
+      <w:r>
+        <w:rPr>
+          <w:b/>
+        </w:rPr>
+        <w:t>Catastrophe tail / Pareto (FIN-9 core)</w:t>
+      </w:r>
+      <w:r>
+        <w:t xml:space="preserve"> — </w:t>
+      </w:r>
+      <w:r>
+        <w:rPr>
+          <w:rFonts w:ascii="Consolas" w:hAnsi="Consolas"/>
+          <w:sz w:val="18"/>
+        </w:rPr>
+        <w:t>K_TAIL</w:t>
+      </w:r>
+      <w:r>
+        <w:t xml:space="preserve">, the Pareto alpha + LGB mixture — </w:t>
+      </w:r>
+      <w:r>
+        <w:rPr>
+          <w:b/>
+        </w:rPr>
+        <w:t>your domain; flagged as needs-your-judgement.</w:t>
+      </w:r>
+    </w:p>
+    <w:p>
+      <w:r>
+        <w:rPr>
+          <w:b/>
+        </w:rPr>
+        <w:t>Prep provided:</w:t>
+      </w:r>
+      <w:r>
+        <w:t xml:space="preserve"> a sandbox, research-grounded </w:t>
+      </w:r>
+      <w:r>
+        <w:rPr>
+          <w:b/>
+        </w:rPr>
+        <w:t>best-attempt comparison doc</w:t>
+      </w:r>
+      <w:r>
+        <w:t xml:space="preserve"> is being prepared (</w:t>
+      </w:r>
+      <w:r>
+        <w:rPr>
+          <w:rFonts w:ascii="Consolas" w:hAnsi="Consolas"/>
+          <w:sz w:val="18"/>
+        </w:rPr>
+        <w:t>docs/calibration_prep/</w:t>
+      </w:r>
+      <w:r>
+        <w:t xml:space="preserve"> → a consolidated comparison) — for each parameter: current value, a proposed value/range anchored to SA + international breach data (sources cited), a validation-by-recompute result, a confidence rating, and the specific open question. </w:t>
+      </w:r>
+      <w:r>
+        <w:rPr>
+          <w:b/>
+        </w:rPr>
+        <w:t>These are PREP PROPOSALS, not final</w:t>
+      </w:r>
+      <w:r>
+        <w:t xml:space="preserve"> — a starting point so the session refines rather than starts cold. Final values are set with the colleague and pass the 2-step gate before anything ships.</w:t>
       </w:r>
     </w:p>
     <w:p>

</xml_diff>